<commit_message>
Bugfix ed aggiunto controllo sullo stato inizialedei pulsanti
</commit_message>
<xml_diff>
--- a/procedura_collaudo_square.docx
+++ b/procedura_collaudo_square.docx
@@ -76,19 +76,7 @@
       <w:proofErr w:type="spellEnd"/>
       <w:proofErr w:type="gramEnd"/>
       <w:r>
-        <w:t>, modificando i campi “</w:t>
-      </w:r>
-      <w:r>
-        <w:t>producer</w:t>
-      </w:r>
-      <w:r>
-        <w:t>” e “</w:t>
-      </w:r>
-      <w:r>
-        <w:t>batch</w:t>
-      </w:r>
-      <w:r>
-        <w:t>” della sezione [BOARD]</w:t>
+        <w:t>, modificando i campi “producer” e “batch” della sezione [BOARD]</w:t>
       </w:r>
     </w:p>
     <w:p>
@@ -153,18 +141,13 @@
         <w:jc w:val="both"/>
       </w:pPr>
       <w:r>
-        <w:t>Pr</w:t>
-      </w:r>
-      <w:r>
-        <w:t xml:space="preserve">eparare il manubrio </w:t>
-      </w:r>
-      <w:proofErr w:type="spellStart"/>
-      <w:r>
-        <w:t>Square</w:t>
-      </w:r>
-      <w:proofErr w:type="spellEnd"/>
-      <w:r>
-        <w:t xml:space="preserve"> vicino al computer di collaudo</w:t>
+        <w:t xml:space="preserve">Preparare </w:t>
+      </w:r>
+      <w:r>
+        <w:t>le schede elettroniche</w:t>
+      </w:r>
+      <w:r>
+        <w:t xml:space="preserve"> Square vicino al computer di collaudo</w:t>
       </w:r>
     </w:p>
     <w:p>
@@ -177,15 +160,16 @@
         <w:jc w:val="both"/>
       </w:pPr>
       <w:r>
-        <w:t xml:space="preserve">Accendere il manubrio </w:t>
-      </w:r>
-      <w:proofErr w:type="spellStart"/>
-      <w:r>
-        <w:t>Square</w:t>
-      </w:r>
-      <w:proofErr w:type="spellEnd"/>
-      <w:r>
-        <w:t xml:space="preserve"> premendo un qualsiasi tasto di sinistra</w:t>
+        <w:t xml:space="preserve">Accendere </w:t>
+      </w:r>
+      <w:r>
+        <w:t>le schede elettroniche</w:t>
+      </w:r>
+      <w:r>
+        <w:t xml:space="preserve"> Square premendo un qualsiasi tasto di sinistra</w:t>
+      </w:r>
+      <w:r>
+        <w:t>, eccetto il freno</w:t>
       </w:r>
     </w:p>
     <w:p>
@@ -198,15 +182,13 @@
         <w:jc w:val="both"/>
       </w:pPr>
       <w:r>
-        <w:t xml:space="preserve">Avviare il software di </w:t>
-      </w:r>
-      <w:proofErr w:type="spellStart"/>
-      <w:r>
-        <w:t>collado</w:t>
-      </w:r>
-      <w:proofErr w:type="spellEnd"/>
-      <w:r>
-        <w:t xml:space="preserve"> da “Test SQUARE.exe”</w:t>
+        <w:t>Avviare il software di colla</w:t>
+      </w:r>
+      <w:r>
+        <w:t>u</w:t>
+      </w:r>
+      <w:r>
+        <w:t>do da “Test SQUARE.exe”</w:t>
       </w:r>
     </w:p>
     <w:p>
@@ -295,7 +277,6 @@
         <w:jc w:val="both"/>
       </w:pPr>
       <w:r>
-        <w:lastRenderedPageBreak/>
         <w:t>Si apre la finestra</w:t>
       </w:r>
     </w:p>
@@ -309,7 +290,7 @@
           <w:noProof/>
         </w:rPr>
         <w:drawing>
-          <wp:inline distT="0" distB="0" distL="0" distR="0" wp14:anchorId="620EC948" wp14:editId="7E142646">
+          <wp:inline distT="0" distB="0" distL="0" distR="0" wp14:anchorId="620EC948" wp14:editId="14E32680">
             <wp:extent cx="4971600" cy="2700000"/>
             <wp:effectExtent l="0" t="0" r="635" b="5715"/>
             <wp:docPr id="330678729" name="Immagine 2" descr="Immagine che contiene testo, schermata, software, Software multimediale&#10;&#10;Il contenuto generato dall'IA potrebbe non essere corretto."/>
@@ -481,7 +462,7 @@
           <w:noProof/>
         </w:rPr>
         <w:drawing>
-          <wp:inline distT="0" distB="0" distL="0" distR="0" wp14:anchorId="7F449348" wp14:editId="03375DBF">
+          <wp:inline distT="0" distB="0" distL="0" distR="0" wp14:anchorId="7F449348" wp14:editId="432F9E92">
             <wp:extent cx="4989600" cy="2700000"/>
             <wp:effectExtent l="0" t="0" r="1905" b="5715"/>
             <wp:docPr id="2010468174" name="Immagine 3" descr="Immagine che contiene testo, schermata, software, Icona del computer&#10;&#10;Il contenuto generato dall'IA potrebbe non essere corretto."/>
@@ -534,7 +515,7 @@
         </w:rPr>
         <w:lastRenderedPageBreak/>
         <w:drawing>
-          <wp:inline distT="0" distB="0" distL="0" distR="0" wp14:anchorId="585B631B" wp14:editId="48370E96">
+          <wp:inline distT="0" distB="0" distL="0" distR="0" wp14:anchorId="585B631B" wp14:editId="3C9BE1BB">
             <wp:extent cx="4968000" cy="2700000"/>
             <wp:effectExtent l="0" t="0" r="4445" b="5715"/>
             <wp:docPr id="1819018939" name="Immagine 4" descr="Immagine che contiene testo, schermata, software, Icona del computer&#10;&#10;Il contenuto generato dall'IA potrebbe non essere corretto."/>
@@ -577,6 +558,17 @@
       </w:r>
     </w:p>
     <w:p/>
+    <w:p>
+      <w:r>
+        <w:t>Dalla versione v1.0.0.2 del software di collaudo è stato introdotto il controllo sullo stato iniziale dei pulsanti: qualora, per problemi in fase di assemblaggio della scheda, un pulsante dovesse risultare premuto all’avvio</w:t>
+      </w:r>
+      <w:r>
+        <w:t>,</w:t>
+      </w:r>
+      <w:r>
+        <w:t xml:space="preserve"> il sistema rileva l’errore facendo terminare la procedura di collaudo.</w:t>
+      </w:r>
+    </w:p>
     <w:p/>
     <w:p>
       <w:pPr>
@@ -592,23 +584,7 @@
           <w:szCs w:val="28"/>
           <w:u w:val="single"/>
         </w:rPr>
-        <w:t>COLLAUDO</w:t>
-      </w:r>
-      <w:r>
-        <w:rPr>
-          <w:sz w:val="28"/>
-          <w:szCs w:val="28"/>
-          <w:u w:val="single"/>
-        </w:rPr>
-        <w:t xml:space="preserve"> </w:t>
-      </w:r>
-      <w:r>
-        <w:rPr>
-          <w:sz w:val="28"/>
-          <w:szCs w:val="28"/>
-          <w:u w:val="single"/>
-        </w:rPr>
-        <w:t>FINALE</w:t>
+        <w:t>COLLAUDO FINALE</w:t>
       </w:r>
     </w:p>
     <w:p>
@@ -647,13 +623,7 @@
       </w:r>
       <w:proofErr w:type="spellEnd"/>
       <w:r>
-        <w:t>” della sezione</w:t>
-      </w:r>
-      <w:r>
-        <w:t xml:space="preserve"> </w:t>
-      </w:r>
-      <w:r>
-        <w:t>[</w:t>
+        <w:t>” della sezione [</w:t>
       </w:r>
       <w:proofErr w:type="gramStart"/>
       <w:r>
@@ -726,15 +696,7 @@
         <w:jc w:val="both"/>
       </w:pPr>
       <w:r>
-        <w:t xml:space="preserve">Preparare il manubrio </w:t>
-      </w:r>
-      <w:proofErr w:type="spellStart"/>
-      <w:r>
-        <w:t>Square</w:t>
-      </w:r>
-      <w:proofErr w:type="spellEnd"/>
-      <w:r>
-        <w:t xml:space="preserve"> vicino al computer di collaudo</w:t>
+        <w:t>Preparare il manubrio Square vicino al computer di collaudo</w:t>
       </w:r>
     </w:p>
     <w:p>
@@ -747,40 +709,11 @@
         <w:jc w:val="both"/>
       </w:pPr>
       <w:r>
-        <w:t xml:space="preserve">Accendere il manubrio </w:t>
-      </w:r>
-      <w:proofErr w:type="spellStart"/>
-      <w:r>
-        <w:t>Square</w:t>
-      </w:r>
-      <w:proofErr w:type="spellEnd"/>
-      <w:r>
-        <w:t xml:space="preserve"> premendo un qualsiasi tasto di sinistra</w:t>
-      </w:r>
-    </w:p>
-    <w:p>
-      <w:pPr>
-        <w:pStyle w:val="Paragrafoelenco"/>
-        <w:jc w:val="both"/>
-      </w:pPr>
-    </w:p>
-    <w:p>
-      <w:pPr>
-        <w:pStyle w:val="Paragrafoelenco"/>
-        <w:jc w:val="both"/>
-      </w:pPr>
-    </w:p>
-    <w:p>
-      <w:pPr>
-        <w:pStyle w:val="Paragrafoelenco"/>
-        <w:jc w:val="both"/>
-      </w:pPr>
-    </w:p>
-    <w:p>
-      <w:pPr>
-        <w:pStyle w:val="Paragrafoelenco"/>
-        <w:jc w:val="both"/>
-      </w:pPr>
+        <w:t>Accendere il manubrio Square premendo un qualsiasi tasto di sinistra</w:t>
+      </w:r>
+      <w:r>
+        <w:t>, eccetto il freno</w:t>
+      </w:r>
     </w:p>
     <w:p>
       <w:pPr>
@@ -805,15 +738,13 @@
       </w:pPr>
       <w:r>
         <w:lastRenderedPageBreak/>
-        <w:t xml:space="preserve">Avviare il software di </w:t>
-      </w:r>
-      <w:proofErr w:type="spellStart"/>
-      <w:r>
-        <w:t>collado</w:t>
-      </w:r>
-      <w:proofErr w:type="spellEnd"/>
-      <w:r>
-        <w:t xml:space="preserve"> da “Test SQUARE.exe”</w:t>
+        <w:t>Avviare il software di colla</w:t>
+      </w:r>
+      <w:r>
+        <w:t>u</w:t>
+      </w:r>
+      <w:r>
+        <w:t>do da “Test SQUARE.exe”</w:t>
       </w:r>
     </w:p>
     <w:p>
@@ -890,7 +821,7 @@
           <w:noProof/>
         </w:rPr>
         <w:drawing>
-          <wp:inline distT="0" distB="0" distL="0" distR="0" wp14:anchorId="7BFCD732" wp14:editId="5721D6B7">
+          <wp:inline distT="0" distB="0" distL="0" distR="0" wp14:anchorId="7BFCD732" wp14:editId="37E08D5C">
             <wp:extent cx="4975200" cy="2700000"/>
             <wp:effectExtent l="0" t="0" r="0" b="5715"/>
             <wp:docPr id="685485573" name="Immagine 6" descr="Immagine che contiene testo, schermata, software, Software multimediale&#10;&#10;Il contenuto generato dall'IA potrebbe non essere corretto."/>
@@ -983,7 +914,15 @@
         <w:jc w:val="both"/>
       </w:pPr>
       <w:r>
-        <w:t>Attendere la connessione</w:t>
+        <w:t xml:space="preserve">Controllare che il controllo del numero seriale non rilevi casi anomali (mese e/o </w:t>
+      </w:r>
+      <w:proofErr w:type="gramStart"/>
+      <w:r>
+        <w:t>anno</w:t>
+      </w:r>
+      <w:proofErr w:type="gramEnd"/>
+      <w:r>
+        <w:t xml:space="preserve"> sbagliato, seriale già inserito) </w:t>
       </w:r>
     </w:p>
     <w:p>
@@ -996,7 +935,7 @@
         <w:jc w:val="both"/>
       </w:pPr>
       <w:r>
-        <w:t>Attendere il messaggio “Premere tutti i pulsanti entro 30s” e premere tutti i pulsanti entro il limite di tempo</w:t>
+        <w:t>Attendere la connessione</w:t>
       </w:r>
     </w:p>
     <w:p>
@@ -1009,7 +948,7 @@
         <w:jc w:val="both"/>
       </w:pPr>
       <w:r>
-        <w:t>Verificare che il flag del controllo pulsanti diventi verde</w:t>
+        <w:t>Attendere il messaggio “Premere tutti i pulsanti entro 30s” e premere tutti i pulsanti entro il limite di tempo</w:t>
       </w:r>
     </w:p>
     <w:p>
@@ -1022,7 +961,7 @@
         <w:jc w:val="both"/>
       </w:pPr>
       <w:r>
-        <w:t>Verificare che i parametri scritti in EEPROM siano corretti</w:t>
+        <w:t>Verificare che il flag del controllo pulsanti diventi verde</w:t>
       </w:r>
     </w:p>
     <w:p>
@@ -1035,13 +974,7 @@
         <w:jc w:val="both"/>
       </w:pPr>
       <w:r>
-        <w:t>Verificare che il flag del</w:t>
-      </w:r>
-      <w:r>
-        <w:t>la generazione del LOG</w:t>
-      </w:r>
-      <w:r>
-        <w:t xml:space="preserve"> diventi verde</w:t>
+        <w:t>Verificare che i parametri scritti in EEPROM siano corretti</w:t>
       </w:r>
     </w:p>
     <w:p>
@@ -1054,10 +987,20 @@
         <w:jc w:val="both"/>
       </w:pPr>
       <w:r>
-        <w:t xml:space="preserve">Verificare che </w:t>
-      </w:r>
-      <w:r>
-        <w:t>il numero dell’ANT ID venga aggiornato per il collaudo successivo</w:t>
+        <w:t>Verificare che il flag della generazione del LOG diventi verde</w:t>
+      </w:r>
+    </w:p>
+    <w:p>
+      <w:pPr>
+        <w:pStyle w:val="Paragrafoelenco"/>
+        <w:numPr>
+          <w:ilvl w:val="0"/>
+          <w:numId w:val="3"/>
+        </w:numPr>
+        <w:jc w:val="both"/>
+      </w:pPr>
+      <w:r>
+        <w:t>Verificare che il numero dell’ANT ID venga aggiornato per il collaudo successivo</w:t>
       </w:r>
     </w:p>
     <w:p>
@@ -1083,7 +1026,7 @@
         </w:rPr>
         <w:lastRenderedPageBreak/>
         <w:drawing>
-          <wp:inline distT="0" distB="0" distL="0" distR="0" wp14:anchorId="4440A8D3" wp14:editId="38A26C1F">
+          <wp:inline distT="0" distB="0" distL="0" distR="0" wp14:anchorId="4440A8D3" wp14:editId="3F4AE92F">
             <wp:extent cx="4968000" cy="2700000"/>
             <wp:effectExtent l="0" t="0" r="4445" b="5715"/>
             <wp:docPr id="695182846" name="Immagine 7" descr="Immagine che contiene testo, schermata, software, Icona del computer&#10;&#10;Il contenuto generato dall'IA potrebbe non essere corretto."/>
@@ -1134,7 +1077,7 @@
           <w:noProof/>
         </w:rPr>
         <w:drawing>
-          <wp:inline distT="0" distB="0" distL="0" distR="0" wp14:anchorId="5047E82A" wp14:editId="000771B9">
+          <wp:inline distT="0" distB="0" distL="0" distR="0" wp14:anchorId="5047E82A" wp14:editId="116087EA">
             <wp:extent cx="4957200" cy="2700000"/>
             <wp:effectExtent l="0" t="0" r="0" b="5715"/>
             <wp:docPr id="900145871" name="Immagine 8" descr="Immagine che contiene testo, schermata, software, Icona del computer&#10;&#10;Il contenuto generato dall'IA potrebbe non essere corretto."/>
@@ -1175,6 +1118,17 @@
           </wp:inline>
         </w:drawing>
       </w:r>
+    </w:p>
+    <w:p/>
+    <w:p>
+      <w:r>
+        <w:t>Dalla versione v1.0.0.2 del software di collaudo è stato introdotto il controllo sullo stato iniziale dei pulsanti: qualora, per problemi in fase di assemblaggio della scheda, un pulsante dovesse risultare premuto all’avvio, il sistema rileva l’errore facendo terminare la procedura di collaudo.</w:t>
+      </w:r>
+    </w:p>
+    <w:p>
+      <w:pPr>
+        <w:jc w:val="center"/>
+      </w:pPr>
     </w:p>
     <w:sectPr>
       <w:pgSz w:w="11906" w:h="16838"/>

</xml_diff>